<commit_message>
Actualizar identidad visual con logo TE y paleta cian
</commit_message>
<xml_diff>
--- a/docs/Informe_gestion_alumnos.docx
+++ b/docs/Informe_gestion_alumnos.docx
@@ -65,6 +65,11 @@
       </w:r>
     </w:p>
     <w:p>
+      <w:r>
+        <w:t>Identidad visual: se usa el logo TE proporcionado y su cian #00B2E2, con blanco y un cian más oscuro en barras y botones para facilitar la lectura.</w:t>
+      </w:r>
+    </w:p>
+    <w:p>
       <w:pPr>
         <w:pStyle w:val="Heading1"/>
       </w:pPr>
@@ -96,7 +101,7 @@
               <w:drawing>
                 <wp:inline xmlns:a="http://schemas.openxmlformats.org/drawingml/2006/main" xmlns:pic="http://schemas.openxmlformats.org/drawingml/2006/picture">
                   <wp:extent cx="1508760" cy="3265111"/>
-                  <wp:docPr id="1" name="Picture 1"/>
+                  <wp:docPr id="6" name="Picture 6"/>
                   <wp:cNvGraphicFramePr>
                     <a:graphicFrameLocks noChangeAspect="1"/>
                   </wp:cNvGraphicFramePr>
@@ -108,7 +113,7 @@
                           <pic:cNvPicPr/>
                         </pic:nvPicPr>
                         <pic:blipFill>
-                          <a:blip r:embed="rId9"/>
+                          <a:blip r:embed="rId15"/>
                           <a:stretch>
                             <a:fillRect/>
                           </a:stretch>
@@ -161,7 +166,7 @@
               <w:drawing>
                 <wp:inline xmlns:a="http://schemas.openxmlformats.org/drawingml/2006/main" xmlns:pic="http://schemas.openxmlformats.org/drawingml/2006/picture">
                   <wp:extent cx="1508760" cy="3265111"/>
-                  <wp:docPr id="2" name="Picture 2"/>
+                  <wp:docPr id="7" name="Picture 7"/>
                   <wp:cNvGraphicFramePr>
                     <a:graphicFrameLocks noChangeAspect="1"/>
                   </wp:cNvGraphicFramePr>
@@ -173,7 +178,7 @@
                           <pic:cNvPicPr/>
                         </pic:nvPicPr>
                         <pic:blipFill>
-                          <a:blip r:embed="rId10"/>
+                          <a:blip r:embed="rId16"/>
                           <a:stretch>
                             <a:fillRect/>
                           </a:stretch>
@@ -258,7 +263,7 @@
               <w:drawing>
                 <wp:inline xmlns:a="http://schemas.openxmlformats.org/drawingml/2006/main" xmlns:pic="http://schemas.openxmlformats.org/drawingml/2006/picture">
                   <wp:extent cx="1508760" cy="3265111"/>
-                  <wp:docPr id="3" name="Picture 3"/>
+                  <wp:docPr id="8" name="Picture 8"/>
                   <wp:cNvGraphicFramePr>
                     <a:graphicFrameLocks noChangeAspect="1"/>
                   </wp:cNvGraphicFramePr>
@@ -270,7 +275,7 @@
                           <pic:cNvPicPr/>
                         </pic:nvPicPr>
                         <pic:blipFill>
-                          <a:blip r:embed="rId11"/>
+                          <a:blip r:embed="rId17"/>
                           <a:stretch>
                             <a:fillRect/>
                           </a:stretch>
@@ -323,7 +328,7 @@
               <w:drawing>
                 <wp:inline xmlns:a="http://schemas.openxmlformats.org/drawingml/2006/main" xmlns:pic="http://schemas.openxmlformats.org/drawingml/2006/picture">
                   <wp:extent cx="1508760" cy="3265111"/>
-                  <wp:docPr id="4" name="Picture 4"/>
+                  <wp:docPr id="9" name="Picture 9"/>
                   <wp:cNvGraphicFramePr>
                     <a:graphicFrameLocks noChangeAspect="1"/>
                   </wp:cNvGraphicFramePr>
@@ -335,7 +340,7 @@
                           <pic:cNvPicPr/>
                         </pic:nvPicPr>
                         <pic:blipFill>
-                          <a:blip r:embed="rId12"/>
+                          <a:blip r:embed="rId18"/>
                           <a:stretch>
                             <a:fillRect/>
                           </a:stretch>
@@ -388,7 +393,7 @@
               <w:drawing>
                 <wp:inline xmlns:a="http://schemas.openxmlformats.org/drawingml/2006/main" xmlns:pic="http://schemas.openxmlformats.org/drawingml/2006/picture">
                   <wp:extent cx="1508760" cy="3265111"/>
-                  <wp:docPr id="5" name="Picture 5"/>
+                  <wp:docPr id="10" name="Picture 10"/>
                   <wp:cNvGraphicFramePr>
                     <a:graphicFrameLocks noChangeAspect="1"/>
                   </wp:cNvGraphicFramePr>
@@ -400,7 +405,7 @@
                           <pic:cNvPicPr/>
                         </pic:nvPicPr>
                         <pic:blipFill>
-                          <a:blip r:embed="rId13"/>
+                          <a:blip r:embed="rId19"/>
                           <a:stretch>
                             <a:fillRect/>
                           </a:stretch>
@@ -1174,15 +1179,12 @@
             </w:tcBorders>
           </w:tcPr>
           <w:p>
-            <w:pPr>
-              <w:spacing w:after="40"/>
-            </w:pPr>
             <w:r>
               <w:rPr>
                 <w:rFonts w:ascii="Consolas" w:hAnsi="Consolas"/>
                 <w:sz w:val="17"/>
               </w:rPr>
-              <w:t>Icon(Icons.school)</w:t>
+              <w:t>Image.asset</w:t>
             </w:r>
           </w:p>
         </w:tc>
@@ -1198,14 +1200,8 @@
             </w:tcBorders>
           </w:tcPr>
           <w:p>
-            <w:pPr>
-              <w:spacing w:after="40"/>
-            </w:pPr>
             <w:r>
-              <w:rPr>
-                <w:sz w:val="18"/>
-              </w:rPr>
-              <w:t>Muestra un ícono gráfico para representar alumnos y la aplicación.</w:t>
+              <w:t>Muestra el logo TE guardado en los archivos del proyecto.</w:t>
             </w:r>
           </w:p>
         </w:tc>
@@ -1446,7 +1442,7 @@
     </w:p>
     <w:p>
       <w:r>
-        <w:t>En la interfaz entregada se usan Icon para los gráficos. Si se desea mostrar una imagen remota, Flutter ofrece Image.network. Este ejemplo es una ampliación didáctica y requiere conexión:</w:t>
+        <w:t>El logo TE proporcionado se guardó en assets/te_logo.png y se muestra en la app con Image.asset. Este es el código usado:</w:t>
       </w:r>
     </w:p>
     <w:p>
@@ -1455,12 +1451,12 @@
           <w:rFonts w:ascii="Consolas" w:hAnsi="Consolas"/>
           <w:sz w:val="18"/>
         </w:rPr>
-        <w:t>Image.network('https://ejemplo.com/foto.png')</w:t>
+        <w:t>Image.asset('assets/te_logo.png')</w:t>
       </w:r>
     </w:p>
     <w:p>
       <w:r>
-        <w:t>Para una imagen incluida en el proyecto se puede usar Image.asset('assets/foto.png') y declararla en pubspec.yaml.</w:t>
+        <w:t>La ruta del archivo se declara en pubspec.yaml. Para imágenes remotas, Flutter también ofrece Image.network('https://ejemplo.com/foto.png').</w:t>
       </w:r>
     </w:p>
     <w:sectPr>

</xml_diff>